<commit_message>
docs(M1.1): mẫu giấy xác nhận dùng tên công ty và địa danh hư cấu của đồ án; PDF xem trước dựng lại; ngoại lệ 2.7 bổ sung
</commit_message>
<xml_diff>
--- a/docs/design/proposals/mau-giay-xac-nhan-cong-tac/tpl_work_confirmation.docx
+++ b/docs/design/proposals/mau-giay-xac-nhan-cong-tac/tpl_work_confirmation.docx
@@ -39,13 +39,13 @@
                 <w:sz w:val="26"/>
                 <w:u w:val="none"/>
               </w:rPr>
-              <w:t>[TÊN CÔNG TY]</w:t>
+              <w:t>CÔNG TY TNHH GIẢI PHÁP ABC</w:t>
             </w:r>
           </w:p>
           <w:p>
             <w:pPr>
               <w:spacing w:before="0" w:after="0" w:line="240" w:lineRule="auto"/>
-              <w:ind w:left="1236" w:right="1236"/>
+              <w:ind w:left="772" w:right="772"/>
               <w:jc w:val="center"/>
               <w:pBdr>
                 <w:bottom w:val="single" w:sz="6" w:space="1" w:color="000000"/>
@@ -128,7 +128,7 @@
                 <w:sz w:val="28"/>
                 <w:u w:val="none"/>
               </w:rPr>
-              <w:t xml:space="preserve">[Địa danh], </w:t>
+              <w:t xml:space="preserve">Hà Nội, </w:t>
             </w:r>
             <w:r>
               <w:rPr>

</xml_diff>

<commit_message>
feat(M1.1): khối ký ba tầng (signer_title, signer_name), prompt P4 bản 1.2 bỏ Ông/Bà, tiêu ngữ đường kẻ riêng, số TRIAL trong xem trước; trần Groq 28; test đầu-cuối trên mẫu thật
</commit_message>
<xml_diff>
--- a/docs/design/proposals/mau-giay-xac-nhan-cong-tac/tpl_work_confirmation.docx
+++ b/docs/design/proposals/mau-giay-xac-nhan-cong-tac/tpl_work_confirmation.docx
@@ -102,7 +102,11 @@
           <w:p>
             <w:pPr>
               <w:spacing w:before="0" w:after="0" w:line="240" w:lineRule="auto"/>
+              <w:ind w:left="1134" w:right="1134"/>
               <w:jc w:val="center"/>
+              <w:pBdr>
+                <w:bottom w:val="single" w:sz="6" w:space="1" w:color="000000"/>
+              </w:pBdr>
             </w:pPr>
             <w:r>
               <w:rPr>
@@ -110,7 +114,7 @@
                 <w:b/>
                 <w:i w:val="0"/>
                 <w:sz w:val="28"/>
-                <w:u w:val="single"/>
+                <w:u w:val="none"/>
               </w:rPr>
               <w:t>Độc lập - Tự do - Hạnh phúc</w:t>
             </w:r>
@@ -403,12 +407,12 @@
             <w:r>
               <w:rPr>
                 <w:rFonts w:ascii="Times New Roman" w:hAnsi="Times New Roman" w:eastAsia="Times New Roman" w:cs="Times New Roman"/>
-                <w:b w:val="0"/>
-                <w:i/>
-                <w:sz w:val="26"/>
+                <w:b/>
+                <w:i w:val="0"/>
+                <w:sz w:val="28"/>
                 <w:u w:val="none"/>
               </w:rPr>
-              <w:t>(Ký, ghi rõ họ tên, chức danh và đóng dấu)</w:t>
+              <w:t>{{ signer_title }}</w:t>
             </w:r>
           </w:p>
           <w:p>
@@ -448,7 +452,7 @@
                 <w:sz w:val="28"/>
                 <w:u w:val="none"/>
               </w:rPr>
-              <w:t>{{ signer_user_id }}</w:t>
+              <w:t>{{ signer_name }}</w:t>
             </w:r>
           </w:p>
         </w:tc>

</xml_diff>